<commit_message>
feat: onboarding captures organization type - Phase B completes D1-D9 (#171)
Onboarding asks the organization type on the existing workspace step; the org POST sends it and creates the settings row from the matching preset inside the same transaction (no orphan window), with FORMAL terminology for government/NGO. Legacy untyped orgs get a dismissible admin-only banner. Onboarding cards get the whitespace-nowrap fix proactively. Getting Started guide regenerated to v1.1 (its 'onboarding never asks your type' FAQ was now false). 348 tests green.
</commit_message>
<xml_diff>
--- a/docs/support/ONEKOF_SUPPORT_GUIDE_GETTING_STARTED.docx
+++ b/docs/support/ONEKOF_SUPPORT_GUIDE_GETTING_STARTED.docx
@@ -109,7 +109,7 @@
           <w:sz w:val="21"/>
           <w:szCs w:val="21"/>
         </w:rPr>
-        <w:t xml:space="preserve">Version 1.0 · July 25, 2026</w:t>
+        <w:t xml:space="preserve">Version 1.1 · July 25, 2026</w:t>
       </w:r>
     </w:p>
     <w:p>
@@ -403,7 +403,65 @@
                 <w:sz w:val="20"/>
                 <w:szCs w:val="20"/>
               </w:rPr>
-              <w:t xml:space="preserve">Apply an organization preset / customize sections</w:t>
+              <w:t xml:space="preserve">Choose the organization type at sign-up</w:t>
+            </w:r>
+          </w:p>
+        </w:tc>
+        <w:tc>
+          <w:tcPr>
+            <w:tcW w:type="dxa" w:w="6360"/>
+            <w:tcBorders>
+              <w:top w:val="single" w:color="CCCCCC" w:sz="4"/>
+              <w:left w:val="single" w:color="CCCCCC" w:sz="4"/>
+              <w:bottom w:val="single" w:color="CCCCCC" w:sz="4"/>
+              <w:right w:val="single" w:color="CCCCCC" w:sz="4"/>
+            </w:tcBorders>
+            <w:tcMar>
+              <w:top w:type="dxa" w:w="60"/>
+              <w:left w:type="dxa" w:w="100"/>
+              <w:bottom w:type="dxa" w:w="60"/>
+              <w:right w:type="dxa" w:w="100"/>
+            </w:tcMar>
+          </w:tcPr>
+          <w:p>
+            <w:r>
+              <w:rPr>
+                <w:b w:val="false"/>
+                <w:bCs w:val="false"/>
+                <w:sz w:val="20"/>
+                <w:szCs w:val="20"/>
+              </w:rPr>
+              <w:t xml:space="preserve">The person creating the workspace</w:t>
+            </w:r>
+          </w:p>
+        </w:tc>
+      </w:tr>
+      <w:tr>
+        <w:tc>
+          <w:tcPr>
+            <w:tcW w:type="dxa" w:w="3000"/>
+            <w:tcBorders>
+              <w:top w:val="single" w:color="CCCCCC" w:sz="4"/>
+              <w:left w:val="single" w:color="CCCCCC" w:sz="4"/>
+              <w:bottom w:val="single" w:color="CCCCCC" w:sz="4"/>
+              <w:right w:val="single" w:color="CCCCCC" w:sz="4"/>
+            </w:tcBorders>
+            <w:tcMar>
+              <w:top w:type="dxa" w:w="60"/>
+              <w:left w:type="dxa" w:w="100"/>
+              <w:bottom w:type="dxa" w:w="60"/>
+              <w:right w:type="dxa" w:w="100"/>
+            </w:tcMar>
+          </w:tcPr>
+          <w:p>
+            <w:r>
+              <w:rPr>
+                <w:b w:val="false"/>
+                <w:bCs w:val="false"/>
+                <w:sz w:val="20"/>
+                <w:szCs w:val="20"/>
+              </w:rPr>
+              <w:t xml:space="preserve">Change the organization type / customize sections later</w:t>
             </w:r>
           </w:p>
         </w:tc>
@@ -669,14 +727,14 @@
           <w:sz w:val="21"/>
           <w:szCs w:val="21"/>
         </w:rPr>
-        <w:t xml:space="preserve">Organization preset — </w:t>
-      </w:r>
-      <w:r>
-        <w:rPr>
-          <w:sz w:val="21"/>
-          <w:szCs w:val="21"/>
-        </w:rPr>
-        <w:t xml:space="preserve">a one-click configuration for a type of institution: Ministry / Government, NGO / Non-Profit, Business / Startup, or Education. It decides which sections appear and which features are on.</w:t>
+        <w:t xml:space="preserve">Organization preset (edition) — </w:t>
+      </w:r>
+      <w:r>
+        <w:rPr>
+          <w:sz w:val="21"/>
+          <w:szCs w:val="21"/>
+        </w:rPr>
+        <w:t xml:space="preserve">a configuration for a type of institution: Ministry / Government, NGO / Non-Profit, Business / Startup, Education, or Healthcare. Chosen at sign-up, it decides which sections appear and which features are on. Changeable later by an Owner or Admin.</w:t>
       </w:r>
     </w:p>
     <w:p>
@@ -913,7 +971,24 @@
           <w:sz w:val="21"/>
           <w:szCs w:val="21"/>
         </w:rPr>
-        <w:t xml:space="preserve">Create your workspace: name, web address (auto-suggested), and team size. You land on the Dashboard.</w:t>
+        <w:t xml:space="preserve">Create your workspace: name, web address (auto-suggested), organization type, and team size. You land on the Dashboard.</w:t>
+      </w:r>
+    </w:p>
+    <w:p>
+      <w:pPr>
+        <w:pStyle w:val="ListParagraph"/>
+        <w:numPr>
+          <w:ilvl w:val="0"/>
+          <w:numId w:val="4"/>
+        </w:numPr>
+        <w:spacing w:after="60"/>
+      </w:pPr>
+      <w:r>
+        <w:rPr>
+          <w:sz w:val="21"/>
+          <w:szCs w:val="21"/>
+        </w:rPr>
+        <w:t xml:space="preserve">The organization type — Government/Ministry, NGO/Non-Profit, Business/Startup, Education, Healthcare, or Other — decides which sections appear. Government and NGO workspaces also get formal "Work Cycle" vocabulary instead of "Sprint". Nothing is locked: an Owner or Admin can change any of it later.</w:t>
       </w:r>
     </w:p>
     <w:p>
@@ -946,7 +1021,7 @@
           <w:sz w:val="24"/>
           <w:szCs w:val="24"/>
         </w:rPr>
-        <w:t xml:space="preserve">4.3 Apply the organization type (Owner/Admin)</w:t>
+        <w:t xml:space="preserve">4.3 Change the organization type or fine-tune sections (Owner/Admin)</w:t>
       </w:r>
     </w:p>
     <w:p>
@@ -963,7 +1038,7 @@
           <w:sz w:val="21"/>
           <w:szCs w:val="21"/>
         </w:rPr>
-        <w:t xml:space="preserve">Go to Settings → Customization (direct address: /dashboard/settings/customization).</w:t>
+        <w:t xml:space="preserve">Go to Settings → Customization.</w:t>
       </w:r>
     </w:p>
     <w:p>
@@ -980,7 +1055,7 @@
           <w:sz w:val="21"/>
           <w:szCs w:val="21"/>
         </w:rPr>
-        <w:t xml:space="preserve">Under Quick Start Presets, choose Ministry / Government, NGO / Non-Profit, Business / Startup, or Education. The sections and features adjust immediately in the preview.</w:t>
+        <w:t xml:space="preserve">Under Quick Start Presets, choose Ministry / Government, NGO / Non-Profit, Business / Startup, Education, or Healthcare. The sections and features adjust immediately in the preview.</w:t>
       </w:r>
     </w:p>
     <w:p>
@@ -1365,7 +1440,33 @@
           <w:sz w:val="21"/>
           <w:szCs w:val="21"/>
         </w:rPr>
-        <w:t xml:space="preserve">Applying Ministry, NGO, Business, or Education just sets the toggles; an Owner/Admin can change any individual toggle afterwards.</w:t>
+        <w:t xml:space="preserve">Choosing Ministry, NGO, Business, Education, or Healthcare just sets the toggles; an Owner/Admin can change any individual toggle afterwards.</w:t>
+      </w:r>
+    </w:p>
+    <w:p>
+      <w:pPr>
+        <w:pStyle w:val="ListParagraph"/>
+        <w:numPr>
+          <w:ilvl w:val="0"/>
+          <w:numId w:val="2"/>
+        </w:numPr>
+        <w:spacing w:after="60"/>
+      </w:pPr>
+      <w:r>
+        <w:rPr>
+          <w:b/>
+          <w:bCs/>
+          <w:sz w:val="21"/>
+          <w:szCs w:val="21"/>
+        </w:rPr>
+        <w:t xml:space="preserve">Every workspace is configured from the moment it exists. </w:t>
+      </w:r>
+      <w:r>
+        <w:rPr>
+          <w:sz w:val="21"/>
+          <w:szCs w:val="21"/>
+        </w:rPr>
+        <w:t xml:space="preserve">The chosen edition is written together with the workspace itself, so a new organization is never left in an unconfigured state.</w:t>
       </w:r>
     </w:p>
     <w:p>
@@ -1891,7 +1992,7 @@
                 <w:sz w:val="20"/>
                 <w:szCs w:val="20"/>
               </w:rPr>
-              <w:t xml:space="preserve">"Onboarding never asked whether we are a Ministry or NGO."</w:t>
+              <w:t xml:space="preserve">"Where do I choose Ministry / NGO / Healthcare?"</w:t>
             </w:r>
           </w:p>
         </w:tc>
@@ -1919,7 +2020,65 @@
                 <w:sz w:val="20"/>
                 <w:szCs w:val="20"/>
               </w:rPr>
-              <w:t xml:space="preserve">Correct — onboarding creates a neutral workspace. The organization type is applied afterwards by an Owner/Admin at Settings → Customization (/dashboard/settings/customization).</w:t>
+              <w:t xml:space="preserve">At sign-up: the workspace step asks what kind of organization it is, and the matching edition applies immediately. To change it later, an Owner/Admin uses Settings → Customization.</w:t>
+            </w:r>
+          </w:p>
+        </w:tc>
+      </w:tr>
+      <w:tr>
+        <w:tc>
+          <w:tcPr>
+            <w:tcW w:type="dxa" w:w="3400"/>
+            <w:tcBorders>
+              <w:top w:val="single" w:color="CCCCCC" w:sz="4"/>
+              <w:left w:val="single" w:color="CCCCCC" w:sz="4"/>
+              <w:bottom w:val="single" w:color="CCCCCC" w:sz="4"/>
+              <w:right w:val="single" w:color="CCCCCC" w:sz="4"/>
+            </w:tcBorders>
+            <w:tcMar>
+              <w:top w:type="dxa" w:w="60"/>
+              <w:left w:type="dxa" w:w="100"/>
+              <w:bottom w:type="dxa" w:w="60"/>
+              <w:right w:type="dxa" w:w="100"/>
+            </w:tcMar>
+          </w:tcPr>
+          <w:p>
+            <w:r>
+              <w:rPr>
+                <w:b w:val="false"/>
+                <w:bCs w:val="false"/>
+                <w:sz w:val="20"/>
+                <w:szCs w:val="20"/>
+              </w:rPr>
+              <w:t xml:space="preserve">"Our workspace was created before that question existed."</w:t>
+            </w:r>
+          </w:p>
+        </w:tc>
+        <w:tc>
+          <w:tcPr>
+            <w:tcW w:type="dxa" w:w="5960"/>
+            <w:tcBorders>
+              <w:top w:val="single" w:color="CCCCCC" w:sz="4"/>
+              <w:left w:val="single" w:color="CCCCCC" w:sz="4"/>
+              <w:bottom w:val="single" w:color="CCCCCC" w:sz="4"/>
+              <w:right w:val="single" w:color="CCCCCC" w:sz="4"/>
+            </w:tcBorders>
+            <w:tcMar>
+              <w:top w:type="dxa" w:w="60"/>
+              <w:left w:type="dxa" w:w="100"/>
+              <w:bottom w:type="dxa" w:w="60"/>
+              <w:right w:type="dxa" w:w="100"/>
+            </w:tcMar>
+          </w:tcPr>
+          <w:p>
+            <w:r>
+              <w:rPr>
+                <w:b w:val="false"/>
+                <w:bCs w:val="false"/>
+                <w:sz w:val="20"/>
+                <w:szCs w:val="20"/>
+              </w:rPr>
+              <w:t xml:space="preserve">Its admins see a one-time banner on the Dashboard inviting them to choose the organization type. Until they do, the workspace keeps the general-purpose (Business) configuration — nothing is lost or hidden.</w:t>
             </w:r>
           </w:p>
         </w:tc>
@@ -2323,6 +2482,23 @@
           <w:szCs w:val="21"/>
         </w:rPr>
         <w:t xml:space="preserve">Preset definitions live in code (organization-presets.ts) — support can state exactly what each preset turns on or off.</w:t>
+      </w:r>
+    </w:p>
+    <w:p>
+      <w:pPr>
+        <w:pStyle w:val="ListParagraph"/>
+        <w:numPr>
+          <w:ilvl w:val="0"/>
+          <w:numId w:val="2"/>
+        </w:numPr>
+        <w:spacing w:after="60"/>
+      </w:pPr>
+      <w:r>
+        <w:rPr>
+          <w:sz w:val="21"/>
+          <w:szCs w:val="21"/>
+        </w:rPr>
+        <w:t xml:space="preserve">The organization type chosen at sign-up is stored on the organization and its settings row is created in the same database transaction, so no workspace exists without a configuration. Organizations predating this step have no type and fall back to the general-purpose configuration until an admin chooses one.</w:t>
       </w:r>
     </w:p>
     <w:p>
@@ -2732,7 +2908,7 @@
                 <w:sz w:val="20"/>
                 <w:szCs w:val="20"/>
               </w:rPr>
-              <w:t xml:space="preserve">Apply org type preset, toggle sections</w:t>
+              <w:t xml:space="preserve">Change org type / toggle sections</w:t>
             </w:r>
           </w:p>
         </w:tc>
@@ -2760,7 +2936,7 @@
                 <w:sz w:val="20"/>
                 <w:szCs w:val="20"/>
               </w:rPr>
-              <w:t xml:space="preserve">Settings → Customization (/dashboard/settings/customization) — Owner/Admin</w:t>
+              <w:t xml:space="preserve">Settings → Customization — Owner/Admin</w:t>
             </w:r>
           </w:p>
         </w:tc>

</xml_diff>